<commit_message>
Préserver la continuité des listes Word
</commit_message>
<xml_diff>
--- a/tests/fixtures/docx/native-lists-tei.docx
+++ b/tests/fixtures/docx/native-lists-tei.docx
@@ -122,7 +122,7 @@
         <w:pStyle w:val="Normal"/>
         <w:numPr>
           <w:ilvl w:val="1"/>
-          <w:numId w:val="42"/>
+          <w:numId w:val="44"/>
         </w:numPr>
       </w:pPr>
       <w:r>
@@ -184,7 +184,7 @@
         <w:pStyle w:val="EndnoteText"/>
         <w:numPr>
           <w:ilvl w:val="1"/>
-          <w:numId w:val="42"/>
+          <w:numId w:val="46"/>
         </w:numPr>
       </w:pPr>
       <w:r>
@@ -210,7 +210,7 @@
         <w:pStyle w:val="FootnoteText"/>
         <w:numPr>
           <w:ilvl w:val="0"/>
-          <w:numId w:val="42"/>
+          <w:numId w:val="45"/>
         </w:numPr>
       </w:pPr>
       <w:r>
@@ -222,7 +222,7 @@
         <w:pStyle w:val="FootnoteText"/>
         <w:numPr>
           <w:ilvl w:val="0"/>
-          <w:numId w:val="42"/>
+          <w:numId w:val="45"/>
         </w:numPr>
       </w:pPr>
       <w:r>
@@ -265,6 +265,15 @@
       <w:startOverride w:val="5"/>
     </w:lvlOverride>
   </w:num>
+  <w:num w:numId="44">
+    <w:abstractNumId w:val="10"/>
+  </w:num>
+  <w:num w:numId="45">
+    <w:abstractNumId w:val="10"/>
+  </w:num>
+  <w:num w:numId="46">
+    <w:abstractNumId w:val="10"/>
+  </w:num>
 </w:numbering>
 </file>
 

</xml_diff>